<commit_message>
Update the pdf and word
</commit_message>
<xml_diff>
--- a/Pearls_AQI_Predictor_Project_Report.docx
+++ b/Pearls_AQI_Predictor_Project_Report.docx
@@ -243,20 +243,6 @@
               <w:t>Live Deployment:</w:t>
             </w:r>
           </w:p>
-          <w:p>
-            <w:pPr>
-              <w:spacing w:before="20" w:after="20"/>
-            </w:pPr>
-            <w:r>
-              <w:rPr>
-                <w:rFonts w:ascii="Segoe UI" w:hAnsi="Segoe UI"/>
-                <w:b/>
-                <w:color w:val="1E293B"/>
-                <w:sz w:val="19"/>
-              </w:rPr>
-              <w:t>dad</w:t>
-            </w:r>
-          </w:p>
         </w:tc>
         <w:tc>
           <w:tcPr>
@@ -274,15 +260,17 @@
               <w:spacing w:before="20" w:after="20"/>
               <w:rPr>
                 <w:rFonts w:ascii="Segoe UI" w:hAnsi="Segoe UI" w:cs="Segoe UI"/>
-                <w:sz w:val="20"/>
-                <w:szCs w:val="20"/>
+                <w:color w:val="404040" w:themeColor="text1" w:themeTint="BF"/>
+                <w:sz w:val="19"/>
+                <w:szCs w:val="19"/>
               </w:rPr>
             </w:pPr>
             <w:r>
               <w:rPr>
                 <w:rFonts w:ascii="Segoe UI" w:hAnsi="Segoe UI" w:cs="Segoe UI"/>
-                <w:sz w:val="20"/>
-                <w:szCs w:val="20"/>
+                <w:color w:val="404040" w:themeColor="text1" w:themeTint="BF"/>
+                <w:sz w:val="19"/>
+                <w:szCs w:val="19"/>
               </w:rPr>
               <w:t>https://pearls-aqi-predictor-six.vercel.app/</w:t>
             </w:r>

</xml_diff>